<commit_message>
Feedback presentación 1 modificado
Modificado el feedback de la presentación 1, añadiendo algunos puntos que nos dejamos en la versión anterior. Documento .pages eliminado, solo queda el .docx
</commit_message>
<xml_diff>
--- a/Presentaciones/Feedback Presentación 1.docx
+++ b/Presentaciones/Feedback Presentación 1.docx
@@ -5,356 +5,410 @@
     <w:p>
       <w:pPr>
         <w:pStyle w:val="Título"/>
-        <w:bidi w:val="0"/>
-      </w:pPr>
-      <w:r>
-        <w:rPr>
-          <w:rtl w:val="0"/>
+      </w:pPr>
+      <w:r>
+        <w:rPr>
+          <w:rStyle w:val="Ninguno"/>
+          <w:rtl w:val="0"/>
+          <w:lang w:val="es-ES_tradnl"/>
         </w:rPr>
         <w:t>Presentaci</w:t>
       </w:r>
       <w:r>
         <w:rPr>
-          <w:rtl w:val="0"/>
+          <w:rStyle w:val="Ninguno"/>
+          <w:rtl w:val="0"/>
+          <w:lang w:val="es-ES_tradnl"/>
         </w:rPr>
         <w:t>ó</w:t>
       </w:r>
       <w:r>
         <w:rPr>
-          <w:rtl w:val="0"/>
+          <w:rStyle w:val="Ninguno"/>
+          <w:rtl w:val="0"/>
+          <w:lang w:val="es-ES_tradnl"/>
         </w:rPr>
         <w:t>n 1-Feedback</w:t>
       </w:r>
     </w:p>
     <w:p>
       <w:pPr>
-        <w:pStyle w:val="Cuerpo"/>
+        <w:pStyle w:val="Cuerpo A"/>
         <w:numPr>
           <w:ilvl w:val="0"/>
           <w:numId w:val="2"/>
         </w:numPr>
-        <w:bidi w:val="0"/>
-      </w:pPr>
-      <w:r>
-        <w:rPr>
-          <w:rtl w:val="0"/>
-        </w:rPr>
-        <w:t>Tener c</w:t>
-      </w:r>
-      <w:r>
-        <w:rPr>
-          <w:rtl w:val="0"/>
-        </w:rPr>
-        <w:t>laro lo que vamos a hacer y objetivos</w:t>
-      </w:r>
-      <w:r>
-        <w:rPr>
-          <w:rtl w:val="0"/>
-        </w:rPr>
-        <w:t>.</w:t>
+        <w:rPr>
+          <w:lang w:val="es-ES_tradnl"/>
+        </w:rPr>
+      </w:pPr>
+      <w:r>
+        <w:rPr>
+          <w:rStyle w:val="Ninguno"/>
+          <w:rtl w:val="0"/>
+          <w:lang w:val="es-ES_tradnl"/>
+        </w:rPr>
+        <w:t>Tener claro lo que vamos a hacer y objetivos.</w:t>
       </w:r>
     </w:p>
     <w:p>
       <w:pPr>
-        <w:pStyle w:val="Cuerpo"/>
-        <w:bidi w:val="0"/>
+        <w:pStyle w:val="Cuerpo A"/>
       </w:pPr>
     </w:p>
     <w:p>
       <w:pPr>
-        <w:pStyle w:val="Cuerpo"/>
+        <w:pStyle w:val="Cuerpo A"/>
         <w:numPr>
           <w:ilvl w:val="0"/>
           <w:numId w:val="2"/>
         </w:numPr>
-        <w:bidi w:val="0"/>
-      </w:pPr>
-      <w:r>
-        <w:rPr>
-          <w:rtl w:val="0"/>
+        <w:rPr>
+          <w:lang w:val="es-ES_tradnl"/>
+        </w:rPr>
+      </w:pPr>
+      <w:r>
+        <w:rPr>
+          <w:rStyle w:val="Ninguno"/>
+          <w:rtl w:val="0"/>
+          <w:lang w:val="es-ES_tradnl"/>
         </w:rPr>
         <w:t>Deber</w:t>
       </w:r>
       <w:r>
         <w:rPr>
-          <w:rtl w:val="0"/>
+          <w:rStyle w:val="Ninguno"/>
+          <w:rtl w:val="0"/>
+          <w:lang w:val="es-ES_tradnl"/>
         </w:rPr>
         <w:t>í</w:t>
       </w:r>
       <w:r>
         <w:rPr>
-          <w:rtl w:val="0"/>
-        </w:rPr>
-        <w:t>amos incluir una p</w:t>
-      </w:r>
-      <w:r>
-        <w:rPr>
-          <w:rtl w:val="0"/>
-        </w:rPr>
-        <w:t>lanificaci</w:t>
-      </w:r>
-      <w:r>
-        <w:rPr>
-          <w:rtl w:val="0"/>
+          <w:rStyle w:val="Ninguno"/>
+          <w:rtl w:val="0"/>
+          <w:lang w:val="es-ES_tradnl"/>
+        </w:rPr>
+        <w:t>amos incluir una planificaci</w:t>
+      </w:r>
+      <w:r>
+        <w:rPr>
+          <w:rStyle w:val="Ninguno"/>
+          <w:rtl w:val="0"/>
+          <w:lang w:val="es-ES_tradnl"/>
         </w:rPr>
         <w:t>ó</w:t>
       </w:r>
       <w:r>
         <w:rPr>
-          <w:rtl w:val="0"/>
-        </w:rPr>
-        <w:t>n</w:t>
-      </w:r>
-      <w:r>
-        <w:rPr>
-          <w:rtl w:val="0"/>
-        </w:rPr>
-        <w:t xml:space="preserve"> semanal.</w:t>
+          <w:rStyle w:val="Ninguno"/>
+          <w:rtl w:val="0"/>
+          <w:lang w:val="es-ES_tradnl"/>
+        </w:rPr>
+        <w:t>n semanal.</w:t>
       </w:r>
     </w:p>
     <w:p>
       <w:pPr>
-        <w:pStyle w:val="Cuerpo"/>
+        <w:pStyle w:val="Cuerpo A"/>
         <w:numPr>
           <w:ilvl w:val="1"/>
           <w:numId w:val="2"/>
         </w:numPr>
-        <w:bidi w:val="0"/>
-      </w:pPr>
-      <w:r>
-        <w:rPr>
-          <w:rtl w:val="0"/>
+        <w:rPr>
+          <w:lang w:val="es-ES_tradnl"/>
+        </w:rPr>
+      </w:pPr>
+      <w:r>
+        <w:rPr>
+          <w:rStyle w:val="Ninguno"/>
+          <w:rtl w:val="0"/>
+          <w:lang w:val="es-ES_tradnl"/>
         </w:rPr>
         <w:t>Ir de lo general a lo concreto: Mostrar primero las fases esquem</w:t>
       </w:r>
       <w:r>
         <w:rPr>
-          <w:rtl w:val="0"/>
+          <w:rStyle w:val="Ninguno"/>
+          <w:rtl w:val="0"/>
+          <w:lang w:val="es-ES_tradnl"/>
         </w:rPr>
         <w:t>á</w:t>
       </w:r>
       <w:r>
         <w:rPr>
-          <w:rtl w:val="0"/>
+          <w:rStyle w:val="Ninguno"/>
+          <w:rtl w:val="0"/>
+          <w:lang w:val="es-ES_tradnl"/>
         </w:rPr>
         <w:t>ticamente (conceptos generales, objetivos, etc.) y despu</w:t>
       </w:r>
       <w:r>
         <w:rPr>
-          <w:rtl w:val="0"/>
+          <w:rStyle w:val="Ninguno"/>
+          <w:rtl w:val="0"/>
+          <w:lang w:val="es-ES_tradnl"/>
         </w:rPr>
         <w:t>é</w:t>
       </w:r>
       <w:r>
         <w:rPr>
-          <w:rtl w:val="0"/>
+          <w:rStyle w:val="Ninguno"/>
+          <w:rtl w:val="0"/>
+          <w:lang w:val="es-ES_tradnl"/>
         </w:rPr>
         <w:t>s mostrar cada semana de forma m</w:t>
       </w:r>
       <w:r>
         <w:rPr>
-          <w:rtl w:val="0"/>
+          <w:rStyle w:val="Ninguno"/>
+          <w:rtl w:val="0"/>
+          <w:lang w:val="es-ES_tradnl"/>
         </w:rPr>
         <w:t>á</w:t>
       </w:r>
       <w:r>
         <w:rPr>
-          <w:rtl w:val="0"/>
+          <w:rStyle w:val="Ninguno"/>
+          <w:rtl w:val="0"/>
+          <w:lang w:val="es-ES_tradnl"/>
         </w:rPr>
         <w:t>s detallada.</w:t>
       </w:r>
     </w:p>
     <w:p>
       <w:pPr>
-        <w:pStyle w:val="Cuerpo"/>
-        <w:bidi w:val="0"/>
+        <w:pStyle w:val="Cuerpo A"/>
       </w:pPr>
     </w:p>
     <w:p>
       <w:pPr>
-        <w:pStyle w:val="Cuerpo"/>
+        <w:pStyle w:val="Cuerpo A"/>
         <w:numPr>
           <w:ilvl w:val="0"/>
           <w:numId w:val="2"/>
         </w:numPr>
-        <w:bidi w:val="0"/>
-      </w:pPr>
-      <w:r>
-        <w:rPr>
-          <w:rtl w:val="0"/>
+        <w:rPr>
+          <w:lang w:val="es-ES_tradnl"/>
+        </w:rPr>
+      </w:pPr>
+      <w:r>
+        <w:rPr>
+          <w:rStyle w:val="Ninguno"/>
+          <w:rtl w:val="0"/>
+          <w:lang w:val="es-ES_tradnl"/>
         </w:rPr>
         <w:t>Mejorar el dise</w:t>
       </w:r>
       <w:r>
         <w:rPr>
-          <w:rtl w:val="0"/>
+          <w:rStyle w:val="Ninguno"/>
+          <w:rtl w:val="0"/>
+          <w:lang w:val="es-ES_tradnl"/>
         </w:rPr>
         <w:t>ñ</w:t>
       </w:r>
       <w:r>
         <w:rPr>
-          <w:rtl w:val="0"/>
+          <w:rStyle w:val="Ninguno"/>
+          <w:rtl w:val="0"/>
+          <w:lang w:val="es-ES_tradnl"/>
         </w:rPr>
         <w:t>o (formato) del PowerPoint.</w:t>
       </w:r>
     </w:p>
     <w:p>
       <w:pPr>
-        <w:pStyle w:val="Cuerpo"/>
-        <w:bidi w:val="0"/>
+        <w:pStyle w:val="Cuerpo A"/>
       </w:pPr>
     </w:p>
     <w:p>
       <w:pPr>
-        <w:pStyle w:val="Cuerpo"/>
+        <w:pStyle w:val="Cuerpo A"/>
         <w:numPr>
           <w:ilvl w:val="0"/>
           <w:numId w:val="2"/>
         </w:numPr>
-        <w:bidi w:val="0"/>
-      </w:pPr>
-      <w:r>
-        <w:rPr>
-          <w:rtl w:val="0"/>
+        <w:rPr>
+          <w:lang w:val="es-ES_tradnl"/>
+        </w:rPr>
+      </w:pPr>
+      <w:r>
+        <w:rPr>
+          <w:rStyle w:val="Ninguno"/>
+          <w:rtl w:val="0"/>
+          <w:lang w:val="es-ES_tradnl"/>
         </w:rPr>
         <w:t>Explicar bien la motivaci</w:t>
       </w:r>
       <w:r>
         <w:rPr>
-          <w:rtl w:val="0"/>
+          <w:rStyle w:val="Ninguno"/>
+          <w:rtl w:val="0"/>
+          <w:lang w:val="es-ES_tradnl"/>
         </w:rPr>
         <w:t>ó</w:t>
       </w:r>
       <w:r>
         <w:rPr>
-          <w:rtl w:val="0"/>
-        </w:rPr>
-        <w:t>n</w:t>
-      </w:r>
-      <w:r>
-        <w:rPr>
-          <w:rtl w:val="0"/>
-        </w:rPr>
-        <w:t>: para qu</w:t>
-      </w:r>
-      <w:r>
-        <w:rPr>
-          <w:rtl w:val="0"/>
+          <w:rStyle w:val="Ninguno"/>
+          <w:rtl w:val="0"/>
+          <w:lang w:val="es-ES_tradnl"/>
+        </w:rPr>
+        <w:t>n: para qu</w:t>
+      </w:r>
+      <w:r>
+        <w:rPr>
+          <w:rStyle w:val="Ninguno"/>
+          <w:rtl w:val="0"/>
+          <w:lang w:val="es-ES_tradnl"/>
         </w:rPr>
         <w:t xml:space="preserve">é </w:t>
       </w:r>
       <w:r>
         <w:rPr>
-          <w:rtl w:val="0"/>
+          <w:rStyle w:val="Ninguno"/>
+          <w:rtl w:val="0"/>
+          <w:lang w:val="es-ES_tradnl"/>
         </w:rPr>
         <w:t>sirve, si es algo nuevo, algo que nos motiva, etc.</w:t>
       </w:r>
     </w:p>
     <w:p>
       <w:pPr>
-        <w:pStyle w:val="Cuerpo"/>
+        <w:pStyle w:val="Cuerpo A"/>
         <w:numPr>
           <w:ilvl w:val="1"/>
           <w:numId w:val="2"/>
         </w:numPr>
-        <w:bidi w:val="0"/>
-      </w:pPr>
-      <w:r>
-        <w:rPr>
-          <w:rtl w:val="0"/>
+        <w:rPr>
+          <w:lang w:val="es-ES_tradnl"/>
+        </w:rPr>
+      </w:pPr>
+      <w:r>
+        <w:rPr>
+          <w:rStyle w:val="Ninguno"/>
+          <w:rtl w:val="0"/>
+          <w:lang w:val="es-ES_tradnl"/>
         </w:rPr>
         <w:t>Deber</w:t>
       </w:r>
       <w:r>
         <w:rPr>
-          <w:rtl w:val="0"/>
+          <w:rStyle w:val="Ninguno"/>
+          <w:rtl w:val="0"/>
+          <w:lang w:val="es-ES_tradnl"/>
         </w:rPr>
         <w:t>í</w:t>
       </w:r>
       <w:r>
         <w:rPr>
-          <w:rtl w:val="0"/>
+          <w:rStyle w:val="Ninguno"/>
+          <w:rtl w:val="0"/>
+          <w:lang w:val="es-ES_tradnl"/>
         </w:rPr>
         <w:t>a ser el primer punto de la presentaci</w:t>
       </w:r>
       <w:r>
         <w:rPr>
-          <w:rtl w:val="0"/>
+          <w:rStyle w:val="Ninguno"/>
+          <w:rtl w:val="0"/>
+          <w:lang w:val="es-ES_tradnl"/>
         </w:rPr>
         <w:t>ó</w:t>
       </w:r>
       <w:r>
         <w:rPr>
-          <w:rtl w:val="0"/>
+          <w:rStyle w:val="Ninguno"/>
+          <w:rtl w:val="0"/>
+          <w:lang w:val="es-ES_tradnl"/>
         </w:rPr>
         <w:t>n (da una visi</w:t>
       </w:r>
       <w:r>
         <w:rPr>
-          <w:rtl w:val="0"/>
+          <w:rStyle w:val="Ninguno"/>
+          <w:rtl w:val="0"/>
+          <w:lang w:val="es-ES_tradnl"/>
         </w:rPr>
         <w:t>ó</w:t>
       </w:r>
       <w:r>
         <w:rPr>
-          <w:rtl w:val="0"/>
+          <w:rStyle w:val="Ninguno"/>
+          <w:rtl w:val="0"/>
+          <w:lang w:val="es-ES_tradnl"/>
         </w:rPr>
         <w:t>n general del proyecto).</w:t>
       </w:r>
     </w:p>
     <w:p>
       <w:pPr>
-        <w:pStyle w:val="Cuerpo"/>
-        <w:bidi w:val="0"/>
+        <w:pStyle w:val="Cuerpo A"/>
       </w:pPr>
     </w:p>
     <w:p>
       <w:pPr>
-        <w:pStyle w:val="Cuerpo"/>
+        <w:pStyle w:val="Cuerpo A"/>
         <w:numPr>
           <w:ilvl w:val="0"/>
           <w:numId w:val="2"/>
         </w:numPr>
-        <w:bidi w:val="0"/>
-      </w:pPr>
-      <w:r>
-        <w:rPr>
-          <w:rtl w:val="0"/>
+        <w:rPr>
+          <w:lang w:val="es-ES_tradnl"/>
+        </w:rPr>
+      </w:pPr>
+      <w:r>
+        <w:rPr>
+          <w:rStyle w:val="Ninguno"/>
+          <w:rtl w:val="0"/>
+          <w:lang w:val="es-ES_tradnl"/>
         </w:rPr>
         <w:t>Organizaci</w:t>
       </w:r>
       <w:r>
         <w:rPr>
-          <w:rtl w:val="0"/>
+          <w:rStyle w:val="Ninguno"/>
+          <w:rtl w:val="0"/>
+          <w:lang w:val="es-ES_tradnl"/>
         </w:rPr>
         <w:t>ó</w:t>
       </w:r>
       <w:r>
         <w:rPr>
-          <w:rtl w:val="0"/>
+          <w:rStyle w:val="Ninguno"/>
+          <w:rtl w:val="0"/>
+          <w:lang w:val="es-ES_tradnl"/>
         </w:rPr>
         <w:t>n del equipo, quienes son, qu</w:t>
       </w:r>
       <w:r>
         <w:rPr>
-          <w:rtl w:val="0"/>
-        </w:rPr>
-        <w:t>é</w:t>
-      </w:r>
-      <w:r>
-        <w:rPr>
-          <w:rtl w:val="0"/>
-        </w:rPr>
-        <w:t xml:space="preserve"> hace cada uno, c</w:t>
-      </w:r>
-      <w:r>
-        <w:rPr>
-          <w:rtl w:val="0"/>
+          <w:rStyle w:val="Ninguno"/>
+          <w:rtl w:val="0"/>
+          <w:lang w:val="es-ES_tradnl"/>
+        </w:rPr>
+        <w:t xml:space="preserve">é </w:t>
+      </w:r>
+      <w:r>
+        <w:rPr>
+          <w:rStyle w:val="Ninguno"/>
+          <w:rtl w:val="0"/>
+          <w:lang w:val="es-ES_tradnl"/>
+        </w:rPr>
+        <w:t>hace cada uno, c</w:t>
+      </w:r>
+      <w:r>
+        <w:rPr>
+          <w:rStyle w:val="Ninguno"/>
+          <w:rtl w:val="0"/>
+          <w:lang w:val="es-ES_tradnl"/>
         </w:rPr>
         <w:t>ó</w:t>
       </w:r>
       <w:r>
         <w:rPr>
+          <w:rStyle w:val="Ninguno"/>
           <w:rtl w:val="0"/>
           <w:lang w:val="pt-PT"/>
         </w:rPr>
@@ -362,40 +416,48 @@
       </w:r>
       <w:r>
         <w:rPr>
-          <w:rtl w:val="0"/>
+          <w:rStyle w:val="Ninguno"/>
+          <w:rtl w:val="0"/>
+          <w:lang w:val="es-ES_tradnl"/>
         </w:rPr>
         <w:t>, roles y responsabilidades del equipo</w:t>
       </w:r>
     </w:p>
     <w:p>
       <w:pPr>
-        <w:pStyle w:val="Cuerpo"/>
-        <w:bidi w:val="0"/>
+        <w:pStyle w:val="Cuerpo A"/>
       </w:pPr>
     </w:p>
     <w:p>
       <w:pPr>
-        <w:pStyle w:val="Cuerpo"/>
+        <w:pStyle w:val="Cuerpo A"/>
         <w:numPr>
           <w:ilvl w:val="0"/>
           <w:numId w:val="2"/>
         </w:numPr>
-        <w:bidi w:val="0"/>
-      </w:pPr>
-      <w:r>
-        <w:rPr>
-          <w:rtl w:val="0"/>
+        <w:rPr>
+          <w:lang w:val="es-ES_tradnl"/>
+        </w:rPr>
+      </w:pPr>
+      <w:r>
+        <w:rPr>
+          <w:rStyle w:val="Ninguno"/>
+          <w:rtl w:val="0"/>
+          <w:lang w:val="es-ES_tradnl"/>
         </w:rPr>
         <w:t>Arquitectura de nuestra aplicaci</w:t>
       </w:r>
       <w:r>
         <w:rPr>
-          <w:rtl w:val="0"/>
+          <w:rStyle w:val="Ninguno"/>
+          <w:rtl w:val="0"/>
+          <w:lang w:val="es-ES_tradnl"/>
         </w:rPr>
         <w:t>ó</w:t>
       </w:r>
       <w:r>
         <w:rPr>
+          <w:rStyle w:val="Ninguno"/>
           <w:rtl w:val="0"/>
           <w:lang w:val="en-US"/>
         </w:rPr>
@@ -403,12 +465,15 @@
       </w:r>
       <w:r>
         <w:rPr>
-          <w:rtl w:val="0"/>
+          <w:rStyle w:val="Ninguno"/>
+          <w:rtl w:val="0"/>
+          <w:lang w:val="es-ES_tradnl"/>
         </w:rPr>
         <w:t>, m</w:t>
       </w:r>
       <w:r>
         <w:rPr>
+          <w:rStyle w:val="Ninguno"/>
           <w:rtl w:val="0"/>
           <w:lang w:val="pt-PT"/>
         </w:rPr>
@@ -416,73 +481,166 @@
       </w:r>
       <w:r>
         <w:rPr>
-          <w:rtl w:val="0"/>
+          <w:rStyle w:val="Ninguno"/>
+          <w:rtl w:val="0"/>
+          <w:lang w:val="es-ES_tradnl"/>
         </w:rPr>
         <w:t xml:space="preserve"> funcionamiento</w:t>
       </w:r>
       <w:r>
         <w:rPr>
-          <w:rtl w:val="0"/>
+          <w:rStyle w:val="Ninguno"/>
+          <w:rtl w:val="0"/>
+          <w:lang w:val="es-ES_tradnl"/>
         </w:rPr>
         <w:t>…</w:t>
       </w:r>
       <w:r>
         <w:rPr>
-          <w:rtl w:val="0"/>
+          <w:rStyle w:val="Ninguno"/>
+          <w:rtl w:val="0"/>
+          <w:lang w:val="es-ES_tradnl"/>
         </w:rPr>
         <w:t>).</w:t>
       </w:r>
     </w:p>
     <w:p>
       <w:pPr>
-        <w:pStyle w:val="Cuerpo"/>
-        <w:bidi w:val="0"/>
+        <w:pStyle w:val="Cuerpo A"/>
       </w:pPr>
     </w:p>
     <w:p>
       <w:pPr>
-        <w:pStyle w:val="Cuerpo"/>
+        <w:pStyle w:val="Cuerpo A"/>
         <w:numPr>
           <w:ilvl w:val="0"/>
           <w:numId w:val="2"/>
         </w:numPr>
-        <w:bidi w:val="0"/>
-      </w:pPr>
-      <w:r>
-        <w:rPr>
-          <w:rtl w:val="0"/>
+        <w:rPr>
+          <w:lang w:val="es-ES_tradnl"/>
+        </w:rPr>
+      </w:pPr>
+      <w:r>
+        <w:rPr>
+          <w:rStyle w:val="Ninguno"/>
+          <w:rtl w:val="0"/>
+          <w:lang w:val="es-ES_tradnl"/>
         </w:rPr>
         <w:t>Casos de uso (qu</w:t>
       </w:r>
       <w:r>
         <w:rPr>
-          <w:rtl w:val="0"/>
+          <w:rStyle w:val="Ninguno"/>
+          <w:rtl w:val="0"/>
+          <w:lang w:val="es-ES_tradnl"/>
         </w:rPr>
         <w:t xml:space="preserve">é </w:t>
       </w:r>
       <w:r>
         <w:rPr>
-          <w:rtl w:val="0"/>
+          <w:rStyle w:val="Ninguno"/>
+          <w:rtl w:val="0"/>
+          <w:lang w:val="es-ES_tradnl"/>
         </w:rPr>
         <w:t>se puede hacer, qu</w:t>
       </w:r>
       <w:r>
         <w:rPr>
-          <w:rtl w:val="0"/>
+          <w:rStyle w:val="Ninguno"/>
+          <w:rtl w:val="0"/>
+          <w:lang w:val="es-ES_tradnl"/>
         </w:rPr>
         <w:t xml:space="preserve">é </w:t>
       </w:r>
       <w:r>
         <w:rPr>
-          <w:rtl w:val="0"/>
-        </w:rPr>
-        <w:t>no se puede hacer, etc.).</w:t>
+          <w:rStyle w:val="Ninguno"/>
+          <w:rtl w:val="0"/>
+          <w:lang w:val="es-ES_tradnl"/>
+        </w:rPr>
+        <w:t>no se puede hacer, etc.)</w:t>
+      </w:r>
+      <w:r>
+        <w:rPr>
+          <w:rStyle w:val="Ninguno"/>
+          <w:rtl w:val="0"/>
+          <w:lang w:val="es-ES_tradnl"/>
+        </w:rPr>
+        <w:t xml:space="preserve"> y que ventaja aporta</w:t>
+      </w:r>
+      <w:r>
+        <w:rPr>
+          <w:rStyle w:val="Ninguno"/>
+          <w:rtl w:val="0"/>
+          <w:lang w:val="es-ES_tradnl"/>
+        </w:rPr>
+        <w:t>.</w:t>
+      </w:r>
+    </w:p>
+    <w:p>
+      <w:pPr>
+        <w:pStyle w:val="Cuerpo A"/>
+        <w:rPr>
+          <w:rStyle w:val="Ninguno"/>
+        </w:rPr>
+      </w:pPr>
+    </w:p>
+    <w:p>
+      <w:pPr>
+        <w:pStyle w:val="Cuerpo A"/>
+        <w:numPr>
+          <w:ilvl w:val="0"/>
+          <w:numId w:val="2"/>
+        </w:numPr>
+        <w:rPr>
+          <w:lang w:val="es-ES_tradnl"/>
+        </w:rPr>
+      </w:pPr>
+      <w:r>
+        <w:rPr>
+          <w:rStyle w:val="Ninguno"/>
+          <w:rtl w:val="0"/>
+          <w:lang w:val="es-ES_tradnl"/>
+        </w:rPr>
+        <w:t>Comunicarnos con Antonio L</w:t>
+      </w:r>
+      <w:r>
+        <w:rPr>
+          <w:rStyle w:val="Ninguno"/>
+          <w:rtl w:val="0"/>
+          <w:lang w:val="es-ES_tradnl"/>
+        </w:rPr>
+        <w:t>ó</w:t>
+      </w:r>
+      <w:r>
+        <w:rPr>
+          <w:rStyle w:val="Ninguno"/>
+          <w:rtl w:val="0"/>
+          <w:lang w:val="es-ES_tradnl"/>
+        </w:rPr>
+        <w:t>pez (coordinador de LIS, experto en visi</w:t>
+      </w:r>
+      <w:r>
+        <w:rPr>
+          <w:rStyle w:val="Ninguno"/>
+          <w:rtl w:val="0"/>
+          <w:lang w:val="es-ES_tradnl"/>
+        </w:rPr>
+        <w:t>ó</w:t>
+      </w:r>
+      <w:r>
+        <w:rPr>
+          <w:rStyle w:val="Ninguno"/>
+          <w:rtl w:val="0"/>
+          <w:lang w:val="es-ES_tradnl"/>
+        </w:rPr>
+        <w:t>n por computador).</w:t>
       </w:r>
     </w:p>
     <w:sectPr>
       <w:headerReference w:type="default" r:id="rId4"/>
       <w:footerReference w:type="default" r:id="rId5"/>
-      <w:pgSz w:w="11906" w:h="16838" w:orient="portrait"/>
+      <w:pgSz w:w="11900" w:h="16840" w:orient="portrait"/>
       <w:pgMar w:top="1134" w:right="1134" w:bottom="1134" w:left="1134" w:header="709" w:footer="850"/>
       <w:bidi w:val="0"/>
     </w:sectPr>
@@ -493,6 +651,9 @@
 <file path=word/footer1.xml><?xml version="1.0" encoding="utf-8"?>
 <w:ftr xmlns:r="http://schemas.openxmlformats.org/officeDocument/2006/relationships" xmlns:wp="http://schemas.openxmlformats.org/drawingml/2006/wordprocessingDrawing" xmlns:w="http://schemas.openxmlformats.org/wordprocessingml/2006/main" xmlns:w10="urn:schemas-microsoft-com:office:word" xmlns:w14="http://schemas.microsoft.com/office/word/2010/wordml" xmlns:wps="http://schemas.microsoft.com/office/word/2010/wordprocessingShape" xmlns:wpg="http://schemas.microsoft.com/office/word/2010/wordprocessingGroup" xmlns:mc="http://schemas.openxmlformats.org/markup-compatibility/2006" xmlns:v="urn:schemas-microsoft-com:vml" xmlns:o="urn:schemas-microsoft-com:office:office" xmlns:m="http://schemas.openxmlformats.org/officeDocument/2006/math" mc:Ignorable="w14">
   <w:p>
+    <w:pPr>
+      <w:pStyle w:val="Cabecera y pie"/>
+    </w:pPr>
     <w:r/>
   </w:p>
 </w:ftr>
@@ -505,13 +666,13 @@
       <w:pStyle w:val="Cabecera y pie"/>
       <w:tabs>
         <w:tab w:val="center" w:pos="4819"/>
-        <w:tab w:val="right" w:pos="9638"/>
+        <w:tab w:val="right" w:pos="9612"/>
         <w:tab w:val="clear" w:pos="9020"/>
       </w:tabs>
-      <w:jc w:val="left"/>
     </w:pPr>
     <w:r>
       <w:rPr>
+        <w:rStyle w:val="Ninguno"/>
         <w:rtl w:val="0"/>
         <w:lang w:val="es-ES_tradnl"/>
       </w:rPr>
@@ -540,7 +701,11 @@
         <w:ind w:left="240" w:hanging="240"/>
       </w:pPr>
       <w:rPr>
-        <w:rFonts w:hAnsi="Arial Unicode MS"/>
+        <w:rFonts w:ascii="Helvetica Neue" w:cs="Helvetica Neue" w:hAnsi="Helvetica Neue" w:eastAsia="Helvetica Neue"/>
+        <w:b w:val="0"/>
+        <w:bCs w:val="0"/>
+        <w:i w:val="0"/>
+        <w:iCs w:val="0"/>
         <w:caps w:val="0"/>
         <w:smallCaps w:val="0"/>
         <w:strike w:val="0"/>
@@ -568,7 +733,11 @@
         <w:ind w:left="480" w:hanging="240"/>
       </w:pPr>
       <w:rPr>
-        <w:rFonts w:hAnsi="Arial Unicode MS"/>
+        <w:rFonts w:ascii="Helvetica Neue" w:cs="Helvetica Neue" w:hAnsi="Helvetica Neue" w:eastAsia="Helvetica Neue"/>
+        <w:b w:val="0"/>
+        <w:bCs w:val="0"/>
+        <w:i w:val="0"/>
+        <w:iCs w:val="0"/>
         <w:caps w:val="0"/>
         <w:smallCaps w:val="0"/>
         <w:strike w:val="0"/>
@@ -596,7 +765,11 @@
         <w:ind w:left="720" w:hanging="240"/>
       </w:pPr>
       <w:rPr>
-        <w:rFonts w:hAnsi="Arial Unicode MS"/>
+        <w:rFonts w:ascii="Helvetica Neue" w:cs="Helvetica Neue" w:hAnsi="Helvetica Neue" w:eastAsia="Helvetica Neue"/>
+        <w:b w:val="0"/>
+        <w:bCs w:val="0"/>
+        <w:i w:val="0"/>
+        <w:iCs w:val="0"/>
         <w:caps w:val="0"/>
         <w:smallCaps w:val="0"/>
         <w:strike w:val="0"/>
@@ -624,7 +797,11 @@
         <w:ind w:left="960" w:hanging="240"/>
       </w:pPr>
       <w:rPr>
-        <w:rFonts w:hAnsi="Arial Unicode MS"/>
+        <w:rFonts w:ascii="Helvetica Neue" w:cs="Helvetica Neue" w:hAnsi="Helvetica Neue" w:eastAsia="Helvetica Neue"/>
+        <w:b w:val="0"/>
+        <w:bCs w:val="0"/>
+        <w:i w:val="0"/>
+        <w:iCs w:val="0"/>
         <w:caps w:val="0"/>
         <w:smallCaps w:val="0"/>
         <w:strike w:val="0"/>
@@ -652,7 +829,11 @@
         <w:ind w:left="1200" w:hanging="240"/>
       </w:pPr>
       <w:rPr>
-        <w:rFonts w:hAnsi="Arial Unicode MS"/>
+        <w:rFonts w:ascii="Helvetica Neue" w:cs="Helvetica Neue" w:hAnsi="Helvetica Neue" w:eastAsia="Helvetica Neue"/>
+        <w:b w:val="0"/>
+        <w:bCs w:val="0"/>
+        <w:i w:val="0"/>
+        <w:iCs w:val="0"/>
         <w:caps w:val="0"/>
         <w:smallCaps w:val="0"/>
         <w:strike w:val="0"/>
@@ -680,7 +861,11 @@
         <w:ind w:left="1440" w:hanging="240"/>
       </w:pPr>
       <w:rPr>
-        <w:rFonts w:hAnsi="Arial Unicode MS"/>
+        <w:rFonts w:ascii="Helvetica Neue" w:cs="Helvetica Neue" w:hAnsi="Helvetica Neue" w:eastAsia="Helvetica Neue"/>
+        <w:b w:val="0"/>
+        <w:bCs w:val="0"/>
+        <w:i w:val="0"/>
+        <w:iCs w:val="0"/>
         <w:caps w:val="0"/>
         <w:smallCaps w:val="0"/>
         <w:strike w:val="0"/>
@@ -708,7 +893,11 @@
         <w:ind w:left="1680" w:hanging="240"/>
       </w:pPr>
       <w:rPr>
-        <w:rFonts w:hAnsi="Arial Unicode MS"/>
+        <w:rFonts w:ascii="Helvetica Neue" w:cs="Helvetica Neue" w:hAnsi="Helvetica Neue" w:eastAsia="Helvetica Neue"/>
+        <w:b w:val="0"/>
+        <w:bCs w:val="0"/>
+        <w:i w:val="0"/>
+        <w:iCs w:val="0"/>
         <w:caps w:val="0"/>
         <w:smallCaps w:val="0"/>
         <w:strike w:val="0"/>
@@ -736,7 +925,11 @@
         <w:ind w:left="1920" w:hanging="240"/>
       </w:pPr>
       <w:rPr>
-        <w:rFonts w:hAnsi="Arial Unicode MS"/>
+        <w:rFonts w:ascii="Helvetica Neue" w:cs="Helvetica Neue" w:hAnsi="Helvetica Neue" w:eastAsia="Helvetica Neue"/>
+        <w:b w:val="0"/>
+        <w:bCs w:val="0"/>
+        <w:i w:val="0"/>
+        <w:iCs w:val="0"/>
         <w:caps w:val="0"/>
         <w:smallCaps w:val="0"/>
         <w:strike w:val="0"/>
@@ -764,7 +957,11 @@
         <w:ind w:left="2160" w:hanging="240"/>
       </w:pPr>
       <w:rPr>
-        <w:rFonts w:hAnsi="Arial Unicode MS"/>
+        <w:rFonts w:ascii="Helvetica Neue" w:cs="Helvetica Neue" w:hAnsi="Helvetica Neue" w:eastAsia="Helvetica Neue"/>
+        <w:b w:val="0"/>
+        <w:bCs w:val="0"/>
+        <w:i w:val="0"/>
+        <w:iCs w:val="0"/>
         <w:caps w:val="0"/>
         <w:smallCaps w:val="0"/>
         <w:strike w:val="0"/>
@@ -935,12 +1132,13 @@
       <w:position w:val="0"/>
       <w:sz w:val="24"/>
       <w:szCs w:val="24"/>
-      <w:u w:val="none"/>
+      <w:u w:val="none" w:color="000000"/>
       <w:shd w:val="nil" w:color="auto" w:fill="auto"/>
       <w:vertAlign w:val="baseline"/>
       <w:lang w:val="es-ES_tradnl"/>
-      <w14:textOutline>
+      <w14:textOutline w14:w="12700" w14:cap="flat">
         <w14:noFill/>
+        <w14:miter w14:lim="400000"/>
       </w14:textOutline>
       <w14:textFill>
         <w14:solidFill>
@@ -949,9 +1147,15 @@
       </w14:textFill>
     </w:rPr>
   </w:style>
+  <w:style w:type="character" w:styleId="Ninguno">
+    <w:name w:val="Ninguno"/>
+    <w:rPr>
+      <w:lang w:val="es-ES_tradnl"/>
+    </w:rPr>
+  </w:style>
   <w:style w:type="paragraph" w:styleId="Título">
     <w:name w:val="Título"/>
-    <w:next w:val="Cuerpo"/>
+    <w:next w:val="Cuerpo A"/>
     <w:pPr>
       <w:keepNext w:val="1"/>
       <w:keepLines w:val="0"/>
@@ -982,12 +1186,13 @@
       <w:position w:val="0"/>
       <w:sz w:val="60"/>
       <w:szCs w:val="60"/>
-      <w:u w:val="none"/>
+      <w:u w:val="none" w:color="000000"/>
       <w:shd w:val="nil" w:color="auto" w:fill="auto"/>
       <w:vertAlign w:val="baseline"/>
       <w:lang w:val="es-ES_tradnl"/>
-      <w14:textOutline>
+      <w14:textOutline w14:w="12700" w14:cap="flat">
         <w14:noFill/>
+        <w14:miter w14:lim="400000"/>
       </w14:textOutline>
       <w14:textFill>
         <w14:solidFill>
@@ -996,9 +1201,9 @@
       </w14:textFill>
     </w:rPr>
   </w:style>
-  <w:style w:type="paragraph" w:styleId="Cuerpo">
-    <w:name w:val="Cuerpo"/>
-    <w:next w:val="Cuerpo"/>
+  <w:style w:type="paragraph" w:styleId="Cuerpo A">
+    <w:name w:val="Cuerpo A"/>
+    <w:next w:val="Cuerpo A"/>
     <w:pPr>
       <w:keepNext w:val="0"/>
       <w:keepLines w:val="0"/>
@@ -1029,12 +1234,13 @@
       <w:position w:val="0"/>
       <w:sz w:val="22"/>
       <w:szCs w:val="22"/>
-      <w:u w:val="none"/>
+      <w:u w:val="none" w:color="000000"/>
       <w:shd w:val="nil" w:color="auto" w:fill="auto"/>
       <w:vertAlign w:val="baseline"/>
       <w:lang w:val="es-ES_tradnl"/>
-      <w14:textOutline>
+      <w14:textOutline w14:w="12700" w14:cap="flat">
         <w14:noFill/>
+        <w14:miter w14:lim="400000"/>
       </w14:textOutline>
       <w14:textFill>
         <w14:solidFill>
@@ -1065,10 +1271,10 @@
         <a:srgbClr val="FFFFFF"/>
       </a:lt1>
       <a:dk2>
-        <a:srgbClr val="5E5E5E"/>
+        <a:srgbClr val="A7A7A7"/>
       </a:dk2>
       <a:lt2>
-        <a:srgbClr val="D5D5D5"/>
+        <a:srgbClr val="535353"/>
       </a:lt2>
       <a:accent1>
         <a:srgbClr val="00A2FF"/>
@@ -1245,11 +1451,14 @@
     <a:spDef>
       <a:spPr>
         <a:solidFill>
-          <a:srgbClr val="000000"/>
+          <a:srgbClr val="FFFFFF"/>
         </a:solidFill>
-        <a:ln w="12700" cap="flat">
-          <a:noFill/>
-          <a:miter lim="400000"/>
+        <a:ln w="25400" cap="flat">
+          <a:solidFill>
+            <a:schemeClr val="accent1"/>
+          </a:solidFill>
+          <a:prstDash val="solid"/>
+          <a:round/>
         </a:ln>
         <a:effectLst/>
         <a:sp3d/>
@@ -1258,34 +1467,34 @@
         <a:spAutoFit/>
       </a:bodyPr>
       <a:lstStyle>
-        <a:defPPr marL="0" marR="0" indent="0" algn="ctr" defTabSz="584200" rtl="0" fontAlgn="auto" latinLnBrk="0" hangingPunct="0">
-          <a:lnSpc>
-            <a:spcPct val="100000"/>
-          </a:lnSpc>
-          <a:spcBef>
-            <a:spcPts val="0"/>
-          </a:spcBef>
-          <a:spcAft>
-            <a:spcPts val="0"/>
-          </a:spcAft>
-          <a:buClrTx/>
-          <a:buSzTx/>
-          <a:buFontTx/>
-          <a:buNone/>
-          <a:tabLst/>
-          <a:defRPr b="0" baseline="0" cap="none" i="0" spc="0" strike="noStrike" sz="1200" u="none" kumimoji="0" normalizeH="0">
-            <a:ln>
-              <a:noFill/>
-            </a:ln>
-            <a:solidFill>
-              <a:srgbClr val="FFFFFF"/>
-            </a:solidFill>
-            <a:effectLst/>
-            <a:uFillTx/>
-            <a:latin typeface="Helvetica Neue Medium"/>
-            <a:ea typeface="Helvetica Neue Medium"/>
-            <a:cs typeface="Helvetica Neue Medium"/>
-            <a:sym typeface="Helvetica Neue Medium"/>
+        <a:defPPr marL="0" marR="0" indent="0" algn="l" defTabSz="914400" rtl="0" fontAlgn="auto" latinLnBrk="0" hangingPunct="0">
+          <a:lnSpc>
+            <a:spcPct val="100000"/>
+          </a:lnSpc>
+          <a:spcBef>
+            <a:spcPts val="0"/>
+          </a:spcBef>
+          <a:spcAft>
+            <a:spcPts val="0"/>
+          </a:spcAft>
+          <a:buClrTx/>
+          <a:buSzTx/>
+          <a:buFontTx/>
+          <a:buNone/>
+          <a:tabLst/>
+          <a:defRPr b="0" baseline="0" cap="none" i="0" spc="0" strike="noStrike" sz="1800" u="none" kumimoji="0" normalizeH="0">
+            <a:ln>
+              <a:noFill/>
+            </a:ln>
+            <a:solidFill>
+              <a:srgbClr val="000000"/>
+            </a:solidFill>
+            <a:effectLst/>
+            <a:uFillTx/>
+            <a:latin typeface="+mn-lt"/>
+            <a:ea typeface="+mn-ea"/>
+            <a:cs typeface="+mn-cs"/>
+            <a:sym typeface="Helvetica Neue"/>
           </a:defRPr>
         </a:defPPr>
         <a:lvl1pPr marL="0" marR="0" indent="0" algn="l" defTabSz="914400" rtl="0" fontAlgn="auto" latinLnBrk="1" hangingPunct="0">
@@ -1535,10 +1744,10 @@
         <a:noFill/>
         <a:ln w="25400" cap="flat">
           <a:solidFill>
-            <a:srgbClr val="000000"/>
+            <a:schemeClr val="accent1"/>
           </a:solidFill>
           <a:prstDash val="solid"/>
-          <a:miter lim="400000"/>
+          <a:round/>
         </a:ln>
         <a:effectLst/>
         <a:sp3d/>
@@ -1829,22 +2038,22 @@
         <a:spAutoFit/>
       </a:bodyPr>
       <a:lstStyle>
-        <a:defPPr marL="0" marR="0" indent="0" algn="l" defTabSz="457200" rtl="0" fontAlgn="auto" latinLnBrk="0" hangingPunct="0">
-          <a:lnSpc>
-            <a:spcPct val="100000"/>
-          </a:lnSpc>
-          <a:spcBef>
-            <a:spcPts val="0"/>
-          </a:spcBef>
-          <a:spcAft>
-            <a:spcPts val="0"/>
-          </a:spcAft>
-          <a:buClrTx/>
-          <a:buSzTx/>
-          <a:buFontTx/>
-          <a:buNone/>
-          <a:tabLst/>
-          <a:defRPr b="0" baseline="0" cap="none" i="0" spc="0" strike="noStrike" sz="1100" u="none" kumimoji="0" normalizeH="0">
+        <a:defPPr marL="0" marR="0" indent="0" algn="l" defTabSz="914400" rtl="0" fontAlgn="auto" latinLnBrk="0" hangingPunct="0">
+          <a:lnSpc>
+            <a:spcPct val="100000"/>
+          </a:lnSpc>
+          <a:spcBef>
+            <a:spcPts val="0"/>
+          </a:spcBef>
+          <a:spcAft>
+            <a:spcPts val="0"/>
+          </a:spcAft>
+          <a:buClrTx/>
+          <a:buSzTx/>
+          <a:buFontTx/>
+          <a:buNone/>
+          <a:tabLst/>
+          <a:defRPr b="0" baseline="0" cap="none" i="0" spc="0" strike="noStrike" sz="1800" u="none" kumimoji="0" normalizeH="0">
             <a:ln>
               <a:noFill/>
             </a:ln>

</xml_diff>